<commit_message>
AZ Hand Surgery letter: set $3,000 retainer; fix response double-period
Retainer set to $3,000. No dba. Signature block left open (no presumed
signer); Mark is only the addressee/contact. Fixed 'P.C..' double period
in the response line.

Co-Authored-By: Claude Opus 4.8 <noreply@anthropic.com>
Claude-Session: https://claude.ai/code/session_01RfN2m1kgBo1xCWLXRNw2zV
</commit_message>
<xml_diff>
--- a/Onyx_Engagement_Letter_AZHandSurgery_HOURLY.docx
+++ b/Onyx_Engagement_Letter_AZHandSurgery_HOURLY.docx
@@ -1877,7 +1877,7 @@
         <w:rPr>
           <w:noProof/>
         </w:rPr>
-        <w:t>[insert amount]</w:t>
+        <w:t>3,000</w:t>
       </w:r>
       <w:r>
         <w:rPr>
@@ -3698,16 +3698,7 @@
         <w:pStyle w:val="CLALTRNormal"/>
       </w:pPr>
       <w:r>
-        <w:t xml:space="preserve">This letter correctly sets forth the understanding of </w:t>
-      </w:r>
-      <w:r>
-        <w:rPr>
-          <w:noProof/>
-        </w:rPr>
-        <w:t>Arizona Center for Hand Surgery, P.C.</w:t>
-      </w:r>
-      <w:r>
-        <w:t>.</w:t>
+        <w:t>This letter correctly sets forth the understanding of Arizona Center for Hand Surgery, P.C.</w:t>
       </w:r>
     </w:p>
     <w:p>

</xml_diff>

<commit_message>
Letters: drop cover tagline/bullets, fold tier labels into prose, right-align fee amounts, tighten signature + time-limitation spacing
Applied to HOURLY and FIXED templates and the AZ Hand Surgery letter.

Co-Authored-By: Claude Opus 4.8 <noreply@anthropic.com>
Claude-Session: https://claude.ai/code/session_01RfN2m1kgBo1xCWLXRNw2zV
</commit_message>
<xml_diff>
--- a/Onyx_Engagement_Letter_AZHandSurgery_HOURLY.docx
+++ b/Onyx_Engagement_Letter_AZHandSurgery_HOURLY.docx
@@ -204,66 +204,6 @@
     <w:p>
       <w:pPr>
         <w:pStyle w:val="CLAProNormalNoSpaceAfter"/>
-        <w:ind w:left="4140" w:hanging="4590"/>
-      </w:pPr>
-      <w:r>
-        <w:rPr>
-          <w:i/>
-        </w:rPr>
-        <w:t>The accounting department your business deserves</w:t>
-      </w:r>
-    </w:p>
-    <w:p>
-      <w:pPr>
-        <w:pStyle w:val="CLAProNormalNoSpaceAfter"/>
-        <w:ind w:left="4140" w:hanging="4590"/>
-      </w:pPr>
-      <w:r>
-        <w:rPr>
-          <w:i/>
-        </w:rPr>
-        <w:t>— without the cost and overhead of building one in-house.</w:t>
-      </w:r>
-    </w:p>
-    <w:p>
-      <w:pPr>
-        <w:pStyle w:val="CLAProNormalNoSpaceAfter"/>
-        <w:ind w:left="4140" w:hanging="4590"/>
-      </w:pPr>
-      <w:r>
-        <w:t>·   Controller-led finance leadership</w:t>
-      </w:r>
-    </w:p>
-    <w:p>
-      <w:pPr>
-        <w:pStyle w:val="CLAProNormalNoSpaceAfter"/>
-        <w:ind w:left="4140" w:hanging="4590"/>
-      </w:pPr>
-      <w:r>
-        <w:t>·   Monthly close &amp; physician reporting</w:t>
-      </w:r>
-    </w:p>
-    <w:p>
-      <w:pPr>
-        <w:pStyle w:val="CLAProNormalNoSpaceAfter"/>
-        <w:ind w:left="4140" w:hanging="4590"/>
-      </w:pPr>
-      <w:r>
-        <w:t>·   Revenue-cycle &amp; board reporting</w:t>
-      </w:r>
-    </w:p>
-    <w:p>
-      <w:pPr>
-        <w:pStyle w:val="CLAProNormalNoSpaceAfter"/>
-        <w:ind w:left="4140" w:hanging="4590"/>
-      </w:pPr>
-      <w:r>
-        <w:t>·   Fractional CFO support</w:t>
-      </w:r>
-    </w:p>
-    <w:p>
-      <w:pPr>
-        <w:pStyle w:val="CLAProNormalNoSpaceAfter"/>
         <w:ind w:left="4140"/>
       </w:pPr>
     </w:p>
@@ -691,6 +631,348 @@
     <w:p>
       <w:pPr>
         <w:pStyle w:val="CLALTRNormal"/>
+        <w:jc w:val="both"/>
+      </w:pPr>
+      <w:r>
+        <w:rPr>
+          <w:b/>
+        </w:rPr>
+        <w:t xml:space="preserve">Day-to-day accounting across the three entities.  </w:t>
+      </w:r>
+      <w:r>
+        <w:rPr/>
+        <w:t>Working with your internal accounting team, ONYX supports the recurring work that keeps the books accurate and close-ready across the practice, the surgery center, and Arizona Pharmacy Consultants:</w:t>
+      </w:r>
+    </w:p>
+    <w:p>
+      <w:pPr>
+        <w:pStyle w:val="CLALTRNormal"/>
+        <w:numPr>
+          <w:ilvl w:val="0"/>
+          <w:numId w:val="9"/>
+        </w:numPr>
+        <w:jc w:val="both"/>
+      </w:pPr>
+      <w:r>
+        <w:rPr/>
+        <w:t>Support accounts payable in QuickBooks Online, including the approval workflow and the international AP resource.</w:t>
+      </w:r>
+    </w:p>
+    <w:p>
+      <w:pPr>
+        <w:pStyle w:val="CLALTRNormal"/>
+        <w:numPr>
+          <w:ilvl w:val="0"/>
+          <w:numId w:val="9"/>
+        </w:numPr>
+        <w:jc w:val="both"/>
+      </w:pPr>
+      <w:r>
+        <w:rPr/>
+        <w:t>Record and reconcile revenue-cycle activity from eClinicalWorks, including patient billing, collections, and cash posting.</w:t>
+      </w:r>
+    </w:p>
+    <w:p>
+      <w:pPr>
+        <w:pStyle w:val="CLALTRNormal"/>
+        <w:numPr>
+          <w:ilvl w:val="0"/>
+          <w:numId w:val="9"/>
+        </w:numPr>
+        <w:jc w:val="both"/>
+      </w:pPr>
+      <w:r>
+        <w:rPr/>
+        <w:t>Support biweekly payroll in Paylocity and the mid-month physician bonus process, including the payroll-to-GL entries.</w:t>
+      </w:r>
+    </w:p>
+    <w:p>
+      <w:pPr>
+        <w:pStyle w:val="CLALTRNormal"/>
+        <w:numPr>
+          <w:ilvl w:val="0"/>
+          <w:numId w:val="9"/>
+        </w:numPr>
+        <w:jc w:val="both"/>
+      </w:pPr>
+      <w:r>
+        <w:rPr/>
+        <w:t>Reconcile accounts and post journal entries each month across all three entities, keeping the books clean and close-ready.</w:t>
+      </w:r>
+    </w:p>
+    <w:p>
+      <w:pPr>
+        <w:pStyle w:val="CLALTRNormal"/>
+        <w:numPr>
+          <w:ilvl w:val="0"/>
+          <w:numId w:val="9"/>
+        </w:numPr>
+        <w:jc w:val="both"/>
+      </w:pPr>
+      <w:r>
+        <w:rPr/>
+        <w:t xml:space="preserve">Maintain depreciation schedules</w:t>
+      </w:r>
+    </w:p>
+    <w:p>
+      <w:pPr>
+        <w:pStyle w:val="CLALTRNormal"/>
+        <w:numPr>
+          <w:ilvl w:val="0"/>
+          <w:numId w:val="9"/>
+        </w:numPr>
+        <w:jc w:val="both"/>
+      </w:pPr>
+      <w:r>
+        <w:rPr/>
+        <w:t>Prepare the EMR-to-GL entries between eClinicalWorks and QuickBooks Online, with exception review.</w:t>
+      </w:r>
+    </w:p>
+    <w:p>
+      <w:pPr>
+        <w:pStyle w:val="CLALTRNormal"/>
+        <w:jc w:val="both"/>
+      </w:pPr>
+      <w:r>
+        <w:rPr>
+          <w:b/>
+        </w:rPr>
+        <w:t xml:space="preserve">Controller-level oversight and reporting.  </w:t>
+      </w:r>
+      <w:r>
+        <w:rPr/>
+        <w:t xml:space="preserve">A second layer of review and reporting that turns clean books into insight, so management always has accurate, timely numbers to act on:</w:t>
+      </w:r>
+    </w:p>
+    <w:p>
+      <w:pPr>
+        <w:pStyle w:val="CLALTRNormal"/>
+        <w:numPr>
+          <w:ilvl w:val="0"/>
+          <w:numId w:val="10"/>
+        </w:numPr>
+        <w:jc w:val="both"/>
+      </w:pPr>
+      <w:r>
+        <w:rPr/>
+        <w:t>Review and approve the reconciliations and journal entries prepared by the internal team, adding a second layer of accuracy and control.</w:t>
+      </w:r>
+    </w:p>
+    <w:p>
+      <w:pPr>
+        <w:pStyle w:val="CLALTRNormal"/>
+        <w:numPr>
+          <w:ilvl w:val="0"/>
+          <w:numId w:val="10"/>
+        </w:numPr>
+        <w:jc w:val="both"/>
+      </w:pPr>
+      <w:r>
+        <w:rPr/>
+        <w:t xml:space="preserve">Reconcile complex accounts and prepare the related journal entries</w:t>
+      </w:r>
+    </w:p>
+    <w:p>
+      <w:pPr>
+        <w:pStyle w:val="CLALTRNormal"/>
+        <w:numPr>
+          <w:ilvl w:val="0"/>
+          <w:numId w:val="10"/>
+        </w:numPr>
+        <w:jc w:val="both"/>
+      </w:pPr>
+      <w:r>
+        <w:rPr/>
+        <w:t>Lead the monthly cash-basis close and produce management, departmental, and physician-level reporting.</w:t>
+      </w:r>
+    </w:p>
+    <w:p>
+      <w:pPr>
+        <w:pStyle w:val="CLALTRNormal"/>
+        <w:numPr>
+          <w:ilvl w:val="0"/>
+          <w:numId w:val="10"/>
+        </w:numPr>
+        <w:jc w:val="both"/>
+      </w:pPr>
+      <w:r>
+        <w:rPr/>
+        <w:t>Prepare revenue-cycle analytics, including gross charges, collection rates, denials, and payer trends, with experienced human review.</w:t>
+      </w:r>
+    </w:p>
+    <w:p>
+      <w:pPr>
+        <w:pStyle w:val="CLALTRNormal"/>
+        <w:numPr>
+          <w:ilvl w:val="0"/>
+          <w:numId w:val="10"/>
+        </w:numPr>
+        <w:jc w:val="both"/>
+      </w:pPr>
+      <w:r>
+        <w:rPr/>
+        <w:t>Document the practice’s accounting processes, the close checklist, and the physician-compensation and bonus procedures.</w:t>
+      </w:r>
+    </w:p>
+    <w:p>
+      <w:pPr>
+        <w:pStyle w:val="CLALTRNormal"/>
+        <w:numPr>
+          <w:ilvl w:val="0"/>
+          <w:numId w:val="10"/>
+        </w:numPr>
+        <w:jc w:val="both"/>
+      </w:pPr>
+      <w:r>
+        <w:rPr/>
+        <w:t>Supervise, mentor, and support the internal accounting team.</w:t>
+      </w:r>
+    </w:p>
+    <w:p>
+      <w:pPr>
+        <w:pStyle w:val="CLALTRNormal"/>
+        <w:numPr>
+          <w:ilvl w:val="0"/>
+          <w:numId w:val="10"/>
+        </w:numPr>
+        <w:jc w:val="both"/>
+      </w:pPr>
+      <w:r>
+        <w:rPr/>
+        <w:t xml:space="preserve">Monitor and manage cash flow so the Client always knows what’s coming in and going out</w:t>
+      </w:r>
+    </w:p>
+    <w:p>
+      <w:pPr>
+        <w:pStyle w:val="CLALTRNormal"/>
+        <w:numPr>
+          <w:ilvl w:val="0"/>
+          <w:numId w:val="10"/>
+        </w:numPr>
+        <w:jc w:val="both"/>
+      </w:pPr>
+      <w:r>
+        <w:rPr/>
+        <w:t>Prepare borrowing-base and lender reporting for Bank of Oklahoma / Bank of Arizona, and assist with routine bank requests.</w:t>
+      </w:r>
+    </w:p>
+    <w:p>
+      <w:pPr>
+        <w:pStyle w:val="CLALTRNormal"/>
+        <w:numPr>
+          <w:ilvl w:val="0"/>
+          <w:numId w:val="10"/>
+        </w:numPr>
+        <w:jc w:val="both"/>
+      </w:pPr>
+      <w:r>
+        <w:rPr/>
+        <w:t>Gather and organize everything your tax team at CBIZ and your auditor need for the annual return and audit. ONYX does not prepare or file tax returns; CBIZ handles all tax filings.</w:t>
+      </w:r>
+    </w:p>
+    <w:p>
+      <w:pPr>
+        <w:pStyle w:val="CLALTRNormal"/>
+        <w:jc w:val="both"/>
+      </w:pPr>
+      <w:r>
+        <w:rPr>
+          <w:b/>
+        </w:rPr>
+        <w:t xml:space="preserve">CFO-level strategic support.  </w:t>
+      </w:r>
+      <w:r>
+        <w:rPr/>
+        <w:t xml:space="preserve">On an as-needed or as-requested basis, ONYX serves as the Client’s strategic financial partner, providing the guidance, perspective, and forward-looking planning of a CFO without the full-time cost:</w:t>
+      </w:r>
+    </w:p>
+    <w:p>
+      <w:pPr>
+        <w:pStyle w:val="CLALTRNormal"/>
+        <w:numPr>
+          <w:ilvl w:val="0"/>
+          <w:numId w:val="10"/>
+        </w:numPr>
+        <w:jc w:val="both"/>
+      </w:pPr>
+      <w:r>
+        <w:rPr/>
+        <w:t>Serve as a consistent, senior financial partner to the physicians, shareholders, and the executive board.</w:t>
+      </w:r>
+    </w:p>
+    <w:p>
+      <w:pPr>
+        <w:pStyle w:val="CLALTRNormal"/>
+        <w:numPr>
+          <w:ilvl w:val="0"/>
+          <w:numId w:val="10"/>
+        </w:numPr>
+        <w:jc w:val="both"/>
+      </w:pPr>
+      <w:r>
+        <w:rPr/>
+        <w:t xml:space="preserve">Advise on financial reporting structure, management reporting, and accounting policy</w:t>
+      </w:r>
+    </w:p>
+    <w:p>
+      <w:pPr>
+        <w:pStyle w:val="CLALTRNormal"/>
+        <w:numPr>
+          <w:ilvl w:val="0"/>
+          <w:numId w:val="10"/>
+        </w:numPr>
+        <w:jc w:val="both"/>
+      </w:pPr>
+      <w:r>
+        <w:rPr/>
+        <w:t xml:space="preserve">Lead budgeting, forecasting, and long-term financial modeling to support growth and scenario planning</w:t>
+      </w:r>
+    </w:p>
+    <w:p>
+      <w:pPr>
+        <w:pStyle w:val="CLALTRNormal"/>
+        <w:numPr>
+          <w:ilvl w:val="0"/>
+          <w:numId w:val="10"/>
+        </w:numPr>
+        <w:jc w:val="both"/>
+      </w:pPr>
+      <w:r>
+        <w:rPr/>
+        <w:t>Support banking and lender relationships, including the lines of credit and borrowing-base reporting.</w:t>
+      </w:r>
+    </w:p>
+    <w:p>
+      <w:pPr>
+        <w:pStyle w:val="CLALTRNormal"/>
+        <w:numPr>
+          <w:ilvl w:val="0"/>
+          <w:numId w:val="10"/>
+        </w:numPr>
+        <w:jc w:val="both"/>
+      </w:pPr>
+      <w:r>
+        <w:rPr/>
+        <w:t>Prepare board and annual shareholder reporting, including the December shareholder meeting.</w:t>
+      </w:r>
+    </w:p>
+    <w:p>
+      <w:pPr>
+        <w:pStyle w:val="CLALTRNormal"/>
+        <w:numPr>
+          <w:ilvl w:val="0"/>
+          <w:numId w:val="10"/>
+        </w:numPr>
+        <w:jc w:val="both"/>
+      </w:pPr>
+      <w:r>
+        <w:rPr/>
+        <w:t>Build an automation roadmap for AP, payroll journals, EMR-to-GL activity, close checklists, and KPI dashboards, using automation and AI as controlled tools with human review of every material output.</w:t>
+      </w:r>
+    </w:p>
+    <w:p>
+      <w:pPr>
+        <w:pStyle w:val="CLALTRNormal"/>
         <w:numPr>
           <w:ilvl w:val="0"/>
           <w:numId w:val="8"/>
@@ -698,372 +980,6 @@
         <w:jc w:val="both"/>
       </w:pPr>
       <w:r>
-        <w:rPr/>
-        <w:t>Day-to-day accounting across the three entities</w:t>
-      </w:r>
-    </w:p>
-    <w:p>
-      <w:pPr>
-        <w:pStyle w:val="CLALTRNormal"/>
-        <w:jc w:val="both"/>
-      </w:pPr>
-      <w:r>
-        <w:rPr/>
-        <w:t>Working with your internal accounting team, ONYX supports the recurring work that keeps the books accurate and close-ready across the practice, the surgery center, and Arizona Pharmacy Consultants:</w:t>
-      </w:r>
-    </w:p>
-    <w:p>
-      <w:pPr>
-        <w:pStyle w:val="CLALTRNormal"/>
-        <w:numPr>
-          <w:ilvl w:val="0"/>
-          <w:numId w:val="9"/>
-        </w:numPr>
-        <w:jc w:val="both"/>
-      </w:pPr>
-      <w:r>
-        <w:rPr/>
-        <w:t>Support accounts payable in QuickBooks Online, including the approval workflow and the international AP resource.</w:t>
-      </w:r>
-    </w:p>
-    <w:p>
-      <w:pPr>
-        <w:pStyle w:val="CLALTRNormal"/>
-        <w:numPr>
-          <w:ilvl w:val="0"/>
-          <w:numId w:val="9"/>
-        </w:numPr>
-        <w:jc w:val="both"/>
-      </w:pPr>
-      <w:r>
-        <w:rPr/>
-        <w:t>Record and reconcile revenue-cycle activity from eClinicalWorks, including patient billing, collections, and cash posting.</w:t>
-      </w:r>
-    </w:p>
-    <w:p>
-      <w:pPr>
-        <w:pStyle w:val="CLALTRNormal"/>
-        <w:numPr>
-          <w:ilvl w:val="0"/>
-          <w:numId w:val="9"/>
-        </w:numPr>
-        <w:jc w:val="both"/>
-      </w:pPr>
-      <w:r>
-        <w:rPr/>
-        <w:t>Support biweekly payroll in Paylocity and the mid-month physician bonus process, including the payroll-to-GL entries.</w:t>
-      </w:r>
-    </w:p>
-    <w:p>
-      <w:pPr>
-        <w:pStyle w:val="CLALTRNormal"/>
-        <w:numPr>
-          <w:ilvl w:val="0"/>
-          <w:numId w:val="9"/>
-        </w:numPr>
-        <w:jc w:val="both"/>
-      </w:pPr>
-      <w:r>
-        <w:rPr/>
-        <w:t>Reconcile accounts and post journal entries each month across all three entities, keeping the books clean and close-ready.</w:t>
-      </w:r>
-    </w:p>
-    <w:p>
-      <w:pPr>
-        <w:pStyle w:val="CLALTRNormal"/>
-        <w:numPr>
-          <w:ilvl w:val="0"/>
-          <w:numId w:val="9"/>
-        </w:numPr>
-        <w:jc w:val="both"/>
-      </w:pPr>
-      <w:r>
-        <w:rPr/>
-        <w:t xml:space="preserve">Maintain depreciation schedules</w:t>
-      </w:r>
-    </w:p>
-    <w:p>
-      <w:pPr>
-        <w:pStyle w:val="CLALTRNormal"/>
-        <w:numPr>
-          <w:ilvl w:val="0"/>
-          <w:numId w:val="9"/>
-        </w:numPr>
-        <w:jc w:val="both"/>
-      </w:pPr>
-      <w:r>
-        <w:rPr/>
-        <w:t>Prepare the EMR-to-GL entries between eClinicalWorks and QuickBooks Online, with exception review.</w:t>
-      </w:r>
-    </w:p>
-    <w:p>
-      <w:pPr>
-        <w:pStyle w:val="CLALTRNormal"/>
-        <w:numPr>
-          <w:ilvl w:val="0"/>
-          <w:numId w:val="8"/>
-        </w:numPr>
-        <w:jc w:val="both"/>
-      </w:pPr>
-      <w:r>
-        <w:rPr/>
-        <w:t xml:space="preserve">Controller-level oversight and reporting</w:t>
-      </w:r>
-    </w:p>
-    <w:p>
-      <w:pPr>
-        <w:pStyle w:val="CLALTRNormal"/>
-        <w:jc w:val="both"/>
-      </w:pPr>
-      <w:r>
-        <w:rPr/>
-        <w:t xml:space="preserve">A second layer of review and reporting that turns clean books into insight, so management always has accurate, timely numbers to act on:</w:t>
-      </w:r>
-    </w:p>
-    <w:p>
-      <w:pPr>
-        <w:pStyle w:val="CLALTRNormal"/>
-        <w:numPr>
-          <w:ilvl w:val="0"/>
-          <w:numId w:val="10"/>
-        </w:numPr>
-        <w:jc w:val="both"/>
-      </w:pPr>
-      <w:r>
-        <w:rPr/>
-        <w:t>Review and approve the reconciliations and journal entries prepared by the internal team, adding a second layer of accuracy and control.</w:t>
-      </w:r>
-    </w:p>
-    <w:p>
-      <w:pPr>
-        <w:pStyle w:val="CLALTRNormal"/>
-        <w:numPr>
-          <w:ilvl w:val="0"/>
-          <w:numId w:val="10"/>
-        </w:numPr>
-        <w:jc w:val="both"/>
-      </w:pPr>
-      <w:r>
-        <w:rPr/>
-        <w:t xml:space="preserve">Reconcile complex accounts and prepare the related journal entries</w:t>
-      </w:r>
-    </w:p>
-    <w:p>
-      <w:pPr>
-        <w:pStyle w:val="CLALTRNormal"/>
-        <w:numPr>
-          <w:ilvl w:val="0"/>
-          <w:numId w:val="10"/>
-        </w:numPr>
-        <w:jc w:val="both"/>
-      </w:pPr>
-      <w:r>
-        <w:rPr/>
-        <w:t>Lead the monthly cash-basis close and produce management, departmental, and physician-level reporting.</w:t>
-      </w:r>
-    </w:p>
-    <w:p>
-      <w:pPr>
-        <w:pStyle w:val="CLALTRNormal"/>
-        <w:numPr>
-          <w:ilvl w:val="0"/>
-          <w:numId w:val="10"/>
-        </w:numPr>
-        <w:jc w:val="both"/>
-      </w:pPr>
-      <w:r>
-        <w:rPr/>
-        <w:t>Prepare revenue-cycle analytics, including gross charges, collection rates, denials, and payer trends, with experienced human review.</w:t>
-      </w:r>
-    </w:p>
-    <w:p>
-      <w:pPr>
-        <w:pStyle w:val="CLALTRNormal"/>
-        <w:numPr>
-          <w:ilvl w:val="0"/>
-          <w:numId w:val="10"/>
-        </w:numPr>
-        <w:jc w:val="both"/>
-      </w:pPr>
-      <w:r>
-        <w:rPr/>
-        <w:t>Document the practice’s accounting processes, the close checklist, and the physician-compensation and bonus procedures.</w:t>
-      </w:r>
-    </w:p>
-    <w:p>
-      <w:pPr>
-        <w:pStyle w:val="CLALTRNormal"/>
-        <w:numPr>
-          <w:ilvl w:val="0"/>
-          <w:numId w:val="10"/>
-        </w:numPr>
-        <w:jc w:val="both"/>
-      </w:pPr>
-      <w:r>
-        <w:rPr/>
-        <w:t>Supervise, mentor, and support the internal accounting team.</w:t>
-      </w:r>
-    </w:p>
-    <w:p>
-      <w:pPr>
-        <w:pStyle w:val="CLALTRNormal"/>
-        <w:numPr>
-          <w:ilvl w:val="0"/>
-          <w:numId w:val="10"/>
-        </w:numPr>
-        <w:jc w:val="both"/>
-      </w:pPr>
-      <w:r>
-        <w:rPr/>
-        <w:t xml:space="preserve">Monitor and manage cash flow so the Client always knows what’s coming in and going out</w:t>
-      </w:r>
-    </w:p>
-    <w:p>
-      <w:pPr>
-        <w:pStyle w:val="CLALTRNormal"/>
-        <w:numPr>
-          <w:ilvl w:val="0"/>
-          <w:numId w:val="10"/>
-        </w:numPr>
-        <w:jc w:val="both"/>
-      </w:pPr>
-      <w:r>
-        <w:rPr/>
-        <w:t>Prepare borrowing-base and lender reporting for Bank of Oklahoma / Bank of Arizona, and assist with routine bank requests.</w:t>
-      </w:r>
-    </w:p>
-    <w:p>
-      <w:pPr>
-        <w:pStyle w:val="CLALTRNormal"/>
-        <w:numPr>
-          <w:ilvl w:val="0"/>
-          <w:numId w:val="10"/>
-        </w:numPr>
-        <w:jc w:val="both"/>
-      </w:pPr>
-      <w:r>
-        <w:rPr/>
-        <w:t>Gather and organize everything your tax team at CBIZ and your auditor need for the annual return and audit. ONYX does not prepare or file tax returns; CBIZ handles all tax filings.</w:t>
-      </w:r>
-    </w:p>
-    <w:p>
-      <w:pPr>
-        <w:pStyle w:val="CLALTRNormal"/>
-        <w:numPr>
-          <w:ilvl w:val="0"/>
-          <w:numId w:val="8"/>
-        </w:numPr>
-        <w:jc w:val="both"/>
-      </w:pPr>
-      <w:r>
-        <w:rPr/>
-        <w:t xml:space="preserve">CFO-level strategic support</w:t>
-      </w:r>
-    </w:p>
-    <w:p>
-      <w:pPr>
-        <w:pStyle w:val="CLALTRNormal"/>
-        <w:jc w:val="both"/>
-      </w:pPr>
-      <w:r>
-        <w:rPr/>
-        <w:t xml:space="preserve">On an as-needed or as-requested basis, ONYX serves as the Client’s strategic financial partner, providing the guidance, perspective, and forward-looking planning of a CFO without the full-time cost:</w:t>
-      </w:r>
-    </w:p>
-    <w:p>
-      <w:pPr>
-        <w:pStyle w:val="CLALTRNormal"/>
-        <w:numPr>
-          <w:ilvl w:val="0"/>
-          <w:numId w:val="10"/>
-        </w:numPr>
-        <w:jc w:val="both"/>
-      </w:pPr>
-      <w:r>
-        <w:rPr/>
-        <w:t>Serve as a consistent, senior financial partner to the physicians, shareholders, and the executive board.</w:t>
-      </w:r>
-    </w:p>
-    <w:p>
-      <w:pPr>
-        <w:pStyle w:val="CLALTRNormal"/>
-        <w:numPr>
-          <w:ilvl w:val="0"/>
-          <w:numId w:val="10"/>
-        </w:numPr>
-        <w:jc w:val="both"/>
-      </w:pPr>
-      <w:r>
-        <w:rPr/>
-        <w:t xml:space="preserve">Advise on financial reporting structure, management reporting, and accounting policy</w:t>
-      </w:r>
-    </w:p>
-    <w:p>
-      <w:pPr>
-        <w:pStyle w:val="CLALTRNormal"/>
-        <w:numPr>
-          <w:ilvl w:val="0"/>
-          <w:numId w:val="10"/>
-        </w:numPr>
-        <w:jc w:val="both"/>
-      </w:pPr>
-      <w:r>
-        <w:rPr/>
-        <w:t xml:space="preserve">Lead budgeting, forecasting, and long-term financial modeling to support growth and scenario planning</w:t>
-      </w:r>
-    </w:p>
-    <w:p>
-      <w:pPr>
-        <w:pStyle w:val="CLALTRNormal"/>
-        <w:numPr>
-          <w:ilvl w:val="0"/>
-          <w:numId w:val="10"/>
-        </w:numPr>
-        <w:jc w:val="both"/>
-      </w:pPr>
-      <w:r>
-        <w:rPr/>
-        <w:t>Support banking and lender relationships, including the lines of credit and borrowing-base reporting.</w:t>
-      </w:r>
-    </w:p>
-    <w:p>
-      <w:pPr>
-        <w:pStyle w:val="CLALTRNormal"/>
-        <w:numPr>
-          <w:ilvl w:val="0"/>
-          <w:numId w:val="10"/>
-        </w:numPr>
-        <w:jc w:val="both"/>
-      </w:pPr>
-      <w:r>
-        <w:rPr/>
-        <w:t>Prepare board and annual shareholder reporting, including the December shareholder meeting.</w:t>
-      </w:r>
-    </w:p>
-    <w:p>
-      <w:pPr>
-        <w:pStyle w:val="CLALTRNormal"/>
-        <w:numPr>
-          <w:ilvl w:val="0"/>
-          <w:numId w:val="10"/>
-        </w:numPr>
-        <w:jc w:val="both"/>
-      </w:pPr>
-      <w:r>
-        <w:rPr/>
-        <w:t>Build an automation roadmap for AP, payroll journals, EMR-to-GL activity, close checklists, and KPI dashboards, using automation and AI as controlled tools with human review of every material output.</w:t>
-      </w:r>
-    </w:p>
-    <w:p>
-      <w:pPr>
-        <w:pStyle w:val="CLALTRNormal"/>
-        <w:numPr>
-          <w:ilvl w:val="0"/>
-          <w:numId w:val="8"/>
-        </w:numPr>
-        <w:jc w:val="both"/>
-      </w:pPr>
-      <w:r>
         <w:t xml:space="preserve">The following additional services are available and, when engaged, are described in the attached addendum(s):</w:t>
       </w:r>
     </w:p>
@@ -1242,50 +1158,19 @@
           <w:ilvl w:val="0"/>
           <w:numId w:val="13"/>
         </w:numPr>
+        <w:tabs>
+          <w:tab w:pos="9360" w:val="right"/>
+        </w:tabs>
         <w:jc w:val="both"/>
       </w:pPr>
       <w:r>
         <w:rPr/>
         <w:t>Services performed by Staff Accountant</w:t>
-      </w:r>
-      <w:r>
-        <w:rPr/>
         <w:tab/>
-      </w:r>
-      <w:r>
-        <w:rPr/>
-        <w:tab/>
-      </w:r>
-      <w:r>
-        <w:rPr/>
-        <w:tab/>
-      </w:r>
-      <w:r>
-        <w:rPr/>
-        <w:tab/>
-      </w:r>
-      <w:r>
-        <w:rPr/>
-        <w:tab/>
-      </w:r>
-      <w:r>
-        <w:rPr/>
-        <w:tab/>
-      </w:r>
-      <w:r>
-        <w:rPr/>
-        <w:tab/>
+        <w:t>$100 per hour</w:t>
       </w:r>
       <w:proofErr w:type="gramStart"/>
-      <w:r>
-        <w:rPr/>
-        <w:t>$100</w:t>
-      </w:r>
       <w:proofErr w:type="gramEnd"/>
-      <w:r>
-        <w:rPr/>
-        <w:t xml:space="preserve"> per hour</w:t>
-      </w:r>
     </w:p>
     <w:p>
       <w:pPr>
@@ -1294,34 +1179,14 @@
           <w:ilvl w:val="0"/>
           <w:numId w:val="13"/>
         </w:numPr>
+        <w:tabs>
+          <w:tab w:pos="9360" w:val="right"/>
+        </w:tabs>
         <w:jc w:val="both"/>
       </w:pPr>
       <w:r>
         <w:rPr/>
         <w:t>Services performed by Controller</w:t>
-      </w:r>
-      <w:r>
-        <w:rPr/>
-        <w:tab/>
-      </w:r>
-      <w:r>
-        <w:rPr/>
-        <w:tab/>
-      </w:r>
-      <w:r>
-        <w:rPr/>
-        <w:tab/>
-      </w:r>
-      <w:r>
-        <w:rPr/>
-        <w:tab/>
-      </w:r>
-      <w:r>
-        <w:rPr/>
-        <w:tab/>
-      </w:r>
-      <w:r>
-        <w:rPr/>
         <w:tab/>
         <w:t>$185 per hour</w:t>
       </w:r>
@@ -1333,32 +1198,14 @@
           <w:ilvl w:val="0"/>
           <w:numId w:val="13"/>
         </w:numPr>
-        <w:jc w:val="both"/>
-      </w:pPr>
-      <w:r>
-        <w:rPr/>
-        <w:t xml:space="preserve">Services performed by </w:t>
-      </w:r>
-      <w:r>
-        <w:rPr>
-          <w:noProof/>
-        </w:rPr>
-        <w:t>CFO</w:t>
-      </w:r>
-      <w:r>
-        <w:rPr/>
-        <w:t/>
-      </w:r>
-      <w:r>
-        <w:rPr/>
-        <w:tab/>
-      </w:r>
-      <w:r>
-        <w:rPr/>
-        <w:tab/>
-      </w:r>
-      <w:r>
-        <w:rPr/>
+        <w:tabs>
+          <w:tab w:pos="9360" w:val="right"/>
+        </w:tabs>
+        <w:jc w:val="both"/>
+      </w:pPr>
+      <w:r>
+        <w:rPr/>
+        <w:t>Services performed by CFO</w:t>
         <w:tab/>
         <w:t>$250 per hour</w:t>
       </w:r>
@@ -2690,18 +2537,6 @@
       <w:r>
         <w:t xml:space="preserve">In no event shall any ONYX Party be liable for any indirect, consequential, special, incidental, exemplary, enhanced, or punitive damages, including without limitation loss of profits, loss of revenue, loss of business opportunity, loss of anticipated savings, loss of data, loss of goodwill, business interruption losses, or attorneys’ fees and costs, regardless of the legal theory asserted and even if advised of the possibility of such damages.</w:t>
       </w:r>
-    </w:p>
-    <w:p>
-      <w:pPr>
-        <w:pStyle w:val="CLALTRNormal"/>
-        <w:jc w:val="both"/>
-      </w:pPr>
-    </w:p>
-    <w:p>
-      <w:pPr>
-        <w:pStyle w:val="CLALTRNormal"/>
-        <w:jc w:val="both"/>
-      </w:pPr>
     </w:p>
     <w:p>
       <w:pPr>
@@ -3627,61 +3462,6 @@
     <w:p>
       <w:pPr>
         <w:pStyle w:val="CLALTRAddressorSignature"/>
-      </w:pPr>
-    </w:p>
-    <w:p>
-      <w:pPr>
-        <w:pStyle w:val="CLALTRHeading1"/>
-      </w:pPr>
-    </w:p>
-    <w:p>
-      <w:pPr>
-        <w:pStyle w:val="CLALTRHeading1"/>
-      </w:pPr>
-    </w:p>
-    <w:p>
-      <w:pPr>
-        <w:pStyle w:val="CLALTRHeading1"/>
-      </w:pPr>
-    </w:p>
-    <w:p>
-      <w:pPr>
-        <w:pStyle w:val="CLALTRHeading1"/>
-      </w:pPr>
-    </w:p>
-    <w:p>
-      <w:pPr>
-        <w:pStyle w:val="CLALTRHeading1"/>
-      </w:pPr>
-    </w:p>
-    <w:p>
-      <w:pPr>
-        <w:pStyle w:val="CLALTRHeading1"/>
-      </w:pPr>
-    </w:p>
-    <w:p>
-      <w:pPr>
-        <w:pStyle w:val="CLALTRHeading1"/>
-      </w:pPr>
-    </w:p>
-    <w:p>
-      <w:pPr>
-        <w:pStyle w:val="CLALTRHeading1"/>
-      </w:pPr>
-    </w:p>
-    <w:p>
-      <w:pPr>
-        <w:pStyle w:val="CLALTRHeading1"/>
-      </w:pPr>
-    </w:p>
-    <w:p>
-      <w:pPr>
-        <w:pStyle w:val="CLALTRHeading1"/>
-      </w:pPr>
-    </w:p>
-    <w:p>
-      <w:pPr>
-        <w:pStyle w:val="CLALTRHeading1"/>
       </w:pPr>
     </w:p>
     <w:p>

</xml_diff>